<commit_message>
Add nationwide dashboards and remove licensing language
</commit_message>
<xml_diff>
--- a/docs/01_AHIP_Public_Overview_Replication_and_Miami_Dade_Case_Study_v1.0.docx
+++ b/docs/01_AHIP_Public_Overview_Replication_and_Miami_Dade_Case_Study_v1.0.docx
@@ -1963,44 +1963,6 @@
     </w:p>
     <w:p>
       <w:pPr>
-        <w:pStyle w:val="Heading1"/>
-      </w:pPr>
-      <w:r>
-        <w:t>9. Public-Use Notice</w:t>
-      </w:r>
-    </w:p>
-    <w:p>
-      <w:pPr>
-        <w:pStyle w:val="BodyText"/>
-        <w:spacing w:after="120"/>
-      </w:pPr>
-      <w:r>
-        <w:t xml:space="preserve">Except where otherwise noted, the original narrative, definitions, tables, and templates in this document are made available under the </w:t>
-      </w:r>
-      <w:hyperlink r:id="rId13">
-        <w:r>
-          <w:rPr>
-            <w:color w:val="0563C1"/>
-            <w:u w:val="single"/>
-          </w:rPr>
-          <w:t>Creative Commons Attribution 4.0 International license (CC BY 4.0)</w:t>
-        </w:r>
-      </w:hyperlink>
-      <w:r>
-        <w:t>. Users may share and adapt these original materials with appropriate attribution and an indication of changes.</w:t>
-      </w:r>
-    </w:p>
-    <w:p>
-      <w:pPr>
-        <w:pStyle w:val="BodyText"/>
-        <w:spacing w:after="120"/>
-      </w:pPr>
-      <w:r>
-        <w:t>This license does not grant additional rights to third-party datasets, source publications, logos, trademarks, or other materials that are separately credited or governed by their own terms. The document is provided for informational and decision-support purposes without a guarantee of results, completeness, or fitness for a particular use.</w:t>
-      </w:r>
-    </w:p>
-    <w:p>
-      <w:pPr>
         <w:pStyle w:val="BodyText"/>
         <w:spacing w:after="120"/>
       </w:pPr>

</xml_diff>